<commit_message>
Add notebook, README and dataset card for UWV long-term unemployment model
- Notebook with all ten required steps: ESS Netherlands data, population
  filter, leakage checks, split first, pipelines, baselines, tuned KNN /
  logistic regression / random forest, single test evaluation, subgroup
  and migration-background checks, threshold choice and a prediction
- README with problem, user group, fit, SDG, comparison table,
  recommendation, ethical reflection, dataset card and run instructions
- Move ESS CSV to data/ with licence and version notes
- Update plan: balanced accuracy as main metric

Co-Authored-By: Claude Opus 5.5 <noreply@anthropic.com>
Claude-Session: https://claude.ai/code/session_01MVmdndxKJRFSyfrRX4P5T7
</commit_message>
<xml_diff>
--- a/docs/Plan_UWV_Hackathon5.docx
+++ b/docs/Plan_UWV_Hackathon5.docx
@@ -2065,7 +2065,7 @@
               <w:spacing w:after="40"/>
             </w:pPr>
             <w:r>
-              <w:t xml:space="preserve">Real user (UWV), real decision (early face-to-face invitation), real existing algorithm (Werkverkenner). Main metric recall, subgroup checks, honest limitations.</w:t>
+              <w:t xml:space="preserve">Real user (UWV), real decision (early face-to-face invitation), real existing algorithm (Werkverkenner). Main metric balanced accuracy, threshold tuned for recall, subgroup checks, honest limitations.</w:t>
             </w:r>
           </w:p>
         </w:tc>
@@ -6440,10 +6440,10 @@
                 <w:b/>
                 <w:bCs/>
               </w:rPr>
-              <w:t xml:space="preserve">Recall</w:t>
-            </w:r>
-            <w:r>
-              <w:t xml:space="preserve"> of the positive class</w:t>
+              <w:t xml:space="preserve">Balanced accuracy</w:t>
+            </w:r>
+            <w:r>
+              <w:t xml:space="preserve"> (average recall of both classes); recall, precision and F1 always reported next to it</w:t>
             </w:r>
           </w:p>
         </w:tc>
@@ -6468,7 +6468,7 @@
               <w:spacing w:after="40"/>
             </w:pPr>
             <w:r>
-              <w:t xml:space="preserve">Missing people who need help is the costliest error</w:t>
+              <w:t xml:space="preserve">Long-term is the majority class (51.5%), so the Dummy invites everyone and gets recall 1.0 — recall alone can never be beaten and rewards inviting everybody, which UWV cannot afford. Balanced accuracy gives that 0.5</w:t>
             </w:r>
           </w:p>
         </w:tc>
@@ -6495,7 +6495,7 @@
               <w:spacing w:after="40"/>
             </w:pPr>
             <w:r>
-              <w:t xml:space="preserve">Guardrail</w:t>
+              <w:t xml:space="preserve">Favouring recall</w:t>
             </w:r>
           </w:p>
         </w:tc>
@@ -6520,7 +6520,7 @@
               <w:spacing w:after="40"/>
             </w:pPr>
             <w:r>
-              <w:t xml:space="preserve">Also report precision and F1; a model that invites everyone (recall 1.0, precision = base rate) is not acceptable</w:t>
+              <w:t xml:space="preserve">In step 9 the decision threshold is lowered (chosen with cross-validated probabilities on the training set) until recall for the long-term group is at least 0.80</w:t>
             </w:r>
           </w:p>
         </w:tc>
@@ -6545,7 +6545,7 @@
               <w:spacing w:after="40"/>
             </w:pPr>
             <w:r>
-              <w:t xml:space="preserve">Capacity is limited; we discuss the threshold in step 9</w:t>
+              <w:t xml:space="preserve">A missed person is the worse mistake; the threshold table shows what extra invitations that costs</w:t>
             </w:r>
           </w:p>
         </w:tc>
@@ -6900,7 +6900,7 @@
         <w:t xml:space="preserve">DummyClassifier(strategy="most_frequent")</w:t>
       </w:r>
       <w:r>
-        <w:t xml:space="preserve"> — note its recall for the positive class is 0 if "no" is the majority.</w:t>
+        <w:t xml:space="preserve"> — long-term is the majority (51.5%), so it invites everyone: recall 1.0 but balanced accuracy 0.5.</w:t>
       </w:r>
     </w:p>
     <w:p>
@@ -6955,7 +6955,7 @@
           <w:sz w:val="20"/>
           <w:szCs w:val="20"/>
         </w:rPr>
-        <w:t xml:space="preserve">scoring="recall"</w:t>
+        <w:t xml:space="preserve">scoring="balanced_accuracy"</w:t>
       </w:r>
       <w:r>
         <w:t xml:space="preserve">, used for all three models.</w:t>
@@ -7320,7 +7320,7 @@
         <w:t xml:space="preserve">cv_results_</w:t>
       </w:r>
       <w:r>
-        <w:t xml:space="preserve">). Plot CV recall vs </w:t>
+        <w:t xml:space="preserve">). Plot CV balanced accuracy vs </w:t>
       </w:r>
       <w:r>
         <w:rPr>
@@ -7331,7 +7331,7 @@
         <w:t xml:space="preserve">n_neighbors</w:t>
       </w:r>
       <w:r>
-        <w:t xml:space="preserve"> and vs </w:t>
+        <w:t xml:space="preserve">, </w:t>
       </w:r>
       <w:r>
         <w:rPr>
@@ -7340,6 +7340,17 @@
           <w:szCs w:val="20"/>
         </w:rPr>
         <w:t xml:space="preserve">C</w:t>
+      </w:r>
+      <w:r>
+        <w:t xml:space="preserve"> and </w:t>
+      </w:r>
+      <w:r>
+        <w:rPr>
+          <w:rFonts w:ascii="Consolas" w:cs="Consolas" w:eastAsia="Consolas" w:hAnsi="Consolas"/>
+          <w:sz w:val="20"/>
+          <w:szCs w:val="20"/>
+        </w:rPr>
+        <w:t xml:space="preserve">max_depth</w:t>
       </w:r>
       <w:r>
         <w:t xml:space="preserve"> (with fold spread as error bars).</w:t>
@@ -8160,7 +8171,7 @@
               <w:spacing w:after="40"/>
             </w:pPr>
             <w:r>
-              <w:t xml:space="preserve">Main metric recall; threshold discussion in step 9</w:t>
+              <w:t xml:space="preserve">Threshold lowered to 0.35 so recall on the long-term group rises (step 9)</w:t>
             </w:r>
           </w:p>
         </w:tc>
@@ -9075,7 +9086,7 @@
       <w:r>
         <w:t xml:space="preserve">UWV algorithm register – Werkverkenner — </w:t>
       </w:r>
-      <w:hyperlink w:history="1" r:id="rId1i-wh6ut4n3bdk-st-gpi">
+      <w:hyperlink w:history="1" r:id="rIdvwbylepme_plh_8wiaaia">
         <w:r>
           <w:rPr>
             <w:rStyle w:val="Hyperlink"/>
@@ -9096,7 +9107,7 @@
       <w:r>
         <w:t xml:space="preserve">UWV – effect of personal services on job chances and WW duration (2021) — </w:t>
       </w:r>
-      <w:hyperlink w:history="1" r:id="rIduunw5bzchnhnsu0yh7oyt">
+      <w:hyperlink w:history="1" r:id="rIdbghm-rmzinu_q3_hntjoj">
         <w:r>
           <w:rPr>
             <w:rStyle w:val="Hyperlink"/>
@@ -9117,7 +9128,7 @@
       <w:r>
         <w:t xml:space="preserve">UWV press release – personal WW services have important value — </w:t>
       </w:r>
-      <w:hyperlink w:history="1" r:id="rId_wmq3gbbbxyrk-t8rbrio">
+      <w:hyperlink w:history="1" r:id="rIdcyn57xn_skh-p_iwrxhro">
         <w:r>
           <w:rPr>
             <w:rStyle w:val="Hyperlink"/>
@@ -9138,7 +9149,7 @@
       <w:r>
         <w:t xml:space="preserve">UWV Kennisverslag 2015-3 (work-orientation conversation) — </w:t>
       </w:r>
-      <w:hyperlink w:history="1" r:id="rId7-hsmzpa-przhtqfxfnia">
+      <w:hyperlink w:history="1" r:id="rIddovndb9ulvxyu7ujjyq3d">
         <w:r>
           <w:rPr>
             <w:rStyle w:val="Hyperlink"/>
@@ -9159,7 +9170,7 @@
       <w:r>
         <w:t xml:space="preserve">Leiden University – forcing broader job search often backfires (2024) — </w:t>
       </w:r>
-      <w:hyperlink w:history="1" r:id="rIdxt8gc24tagn5scezrupwq">
+      <w:hyperlink w:history="1" r:id="rIdem0owsd_z6w1oxpnk1iea">
         <w:r>
           <w:rPr>
             <w:rStyle w:val="Hyperlink"/>
@@ -9180,7 +9191,7 @@
       <w:r>
         <w:t xml:space="preserve">ESS Data Portal — </w:t>
       </w:r>
-      <w:hyperlink w:history="1" r:id="rId7fgb-5pgss9afizciygfv">
+      <w:hyperlink w:history="1" r:id="rIda3aujoay9x4nmoj3amcx1">
         <w:r>
           <w:rPr>
             <w:rStyle w:val="Hyperlink"/>
@@ -9201,7 +9212,7 @@
       <w:r>
         <w:t xml:space="preserve">ESS conditions of use / licence — </w:t>
       </w:r>
-      <w:hyperlink w:history="1" r:id="rIdxymq6gm3i2dim-mulcjzz">
+      <w:hyperlink w:history="1" r:id="rIdqdi0rqpdch6crn0bgbawk">
         <w:r>
           <w:rPr>
             <w:rStyle w:val="Hyperlink"/>
@@ -9222,7 +9233,7 @@
       <w:r>
         <w:t xml:space="preserve">scikit-learn documentation — </w:t>
       </w:r>
-      <w:hyperlink w:history="1" r:id="rIdurrkyoh6g6bs94dlzz29a">
+      <w:hyperlink w:history="1" r:id="rIdorixasgw4gramflactcw3">
         <w:r>
           <w:rPr>
             <w:rStyle w:val="Hyperlink"/>
@@ -9792,7 +9803,7 @@
           <w:sz w:val="18"/>
           <w:szCs w:val="18"/>
         </w:rPr>
-        <w:t xml:space="preserve">   random_state=42), scoring='recall' for all three. Grids: KNN n_neighbors odd 1..51 + weights;</w:t>
+        <w:t xml:space="preserve">   random_state=42), scoring='balanced_accuracy' for all three. Grids: KNN n_neighbors odd 1..51 + weights;</w:t>
       </w:r>
     </w:p>
     <w:p>
@@ -9837,7 +9848,7 @@
           <w:sz w:val="18"/>
           <w:szCs w:val="18"/>
         </w:rPr>
-        <w:t xml:space="preserve">   Report CV mean +/- std. Plot CV recall vs n_neighbors and vs C with error bars.</w:t>
+        <w:t xml:space="preserve">   Report CV mean +/- std. Plot CV balanced accuracy vs n_neighbors, C and max_depth with error bars.</w:t>
       </w:r>
     </w:p>
     <w:p>

</xml_diff>